<commit_message>
CIV-046: fix Word TOC, Turkish language and cover compatibility
</commit_message>
<xml_diff>
--- a/app/templates_docx/faaliyet_raporu.docx
+++ b/app/templates_docx/faaliyet_raporu.docx
@@ -11,13 +11,36 @@
       </w:r>
     </w:p>
     <w:sectPr>
+      <w:headerReference w:type="first" r:id="rId9"/>
+      <w:footerReference w:type="first" r:id="rId10"/>
       <w:pgSz w:w="11906" w:h="16838"/>
       <w:pgMar w:top="1247" w:right="1134" w:bottom="1247" w:left="1134" w:header="567" w:footer="567" w:gutter="0"/>
       <w:cols w:space="720"/>
+      <w:titlePg/>
       <w:docGrid w:linePitch="360"/>
     </w:sectPr>
   </w:body>
 </w:document>
+</file>
+
+<file path=word/footer1.xml><?xml version="1.0" encoding="utf-8"?>
+<w:ftr xmlns:m="http://schemas.openxmlformats.org/officeDocument/2006/math" xmlns:mc="http://schemas.openxmlformats.org/markup-compatibility/2006" xmlns:mo="http://schemas.microsoft.com/office/mac/office/2008/main" xmlns:mv="urn:schemas-microsoft-com:mac:vml" xmlns:o="urn:schemas-microsoft-com:office:office" xmlns:r="http://schemas.openxmlformats.org/officeDocument/2006/relationships" xmlns:v="urn:schemas-microsoft-com:vml" xmlns:w10="urn:schemas-microsoft-com:office:word" xmlns:w14="http://schemas.microsoft.com/office/word/2010/wordml" xmlns:w="http://schemas.openxmlformats.org/wordprocessingml/2006/main" xmlns:wne="http://schemas.microsoft.com/office/word/2006/wordml" xmlns:wp14="http://schemas.microsoft.com/office/word/2010/wordprocessingDrawing" xmlns:wp="http://schemas.openxmlformats.org/drawingml/2006/wordprocessingDrawing" xmlns:wpc="http://schemas.microsoft.com/office/word/2010/wordprocessingCanvas" xmlns:wpg="http://schemas.microsoft.com/office/word/2010/wordprocessingGroup" xmlns:wpi="http://schemas.microsoft.com/office/word/2010/wordprocessingInk" xmlns:wps="http://schemas.microsoft.com/office/word/2010/wordprocessingShape" mc:Ignorable="w14 wp14">
+  <w:p>
+    <w:pPr>
+      <w:pStyle w:val="CivensaGövde"/>
+    </w:pPr>
+  </w:p>
+</w:ftr>
+</file>
+
+<file path=word/header1.xml><?xml version="1.0" encoding="utf-8"?>
+<w:hdr xmlns:m="http://schemas.openxmlformats.org/officeDocument/2006/math" xmlns:mc="http://schemas.openxmlformats.org/markup-compatibility/2006" xmlns:mo="http://schemas.microsoft.com/office/mac/office/2008/main" xmlns:mv="urn:schemas-microsoft-com:mac:vml" xmlns:o="urn:schemas-microsoft-com:office:office" xmlns:r="http://schemas.openxmlformats.org/officeDocument/2006/relationships" xmlns:v="urn:schemas-microsoft-com:vml" xmlns:w10="urn:schemas-microsoft-com:office:word" xmlns:w14="http://schemas.microsoft.com/office/word/2010/wordml" xmlns:w="http://schemas.openxmlformats.org/wordprocessingml/2006/main" xmlns:wne="http://schemas.microsoft.com/office/word/2006/wordml" xmlns:wp14="http://schemas.microsoft.com/office/word/2010/wordprocessingDrawing" xmlns:wp="http://schemas.openxmlformats.org/drawingml/2006/wordprocessingDrawing" xmlns:wpc="http://schemas.microsoft.com/office/word/2010/wordprocessingCanvas" xmlns:wpg="http://schemas.microsoft.com/office/word/2010/wordprocessingGroup" xmlns:wpi="http://schemas.microsoft.com/office/word/2010/wordprocessingInk" xmlns:wps="http://schemas.microsoft.com/office/word/2010/wordprocessingShape" mc:Ignorable="w14 wp14">
+  <w:p>
+    <w:pPr>
+      <w:pStyle w:val="CivensaGövde"/>
+    </w:pPr>
+  </w:p>
+</w:hdr>
 </file>
 
 <file path=word/numbering.xml><?xml version="1.0" encoding="utf-8"?>
@@ -228,10 +251,10 @@
   <w:docDefaults>
     <w:rPrDefault>
       <w:rPr>
-        <w:rFonts w:asciiTheme="minorHAnsi" w:eastAsiaTheme="minorEastAsia" w:hAnsiTheme="minorHAnsi" w:cstheme="minorBidi"/>
-        <w:sz w:val="22"/>
+        <w:rFonts w:eastAsiaTheme="minorEastAsia" w:cstheme="minorBidi" w:ascii="Arial" w:hAnsi="Arial"/>
+        <w:sz w:val="20"/>
         <w:szCs w:val="22"/>
-        <w:lang w:val="en-US" w:eastAsia="en-US" w:bidi="ar-SA"/>
+        <w:lang w:val="tr-TR" w:eastAsia="en-US" w:bidi="ar-SA"/>
       </w:rPr>
     </w:rPrDefault>
     <w:pPrDefault>
@@ -383,6 +406,10 @@
     <w:name w:val="Normal"/>
     <w:qFormat/>
     <w:rsid w:val="00FC693F"/>
+    <w:rPr>
+      <w:rFonts w:ascii="Arial" w:hAnsi="Arial"/>
+      <w:sz w:val="20"/>
+    </w:rPr>
   </w:style>
   <w:style w:type="paragraph" w:styleId="Header">
     <w:name w:val="header"/>
@@ -12074,65 +12101,117 @@
       <w:spacing w:after="140"/>
     </w:pPr>
     <w:rPr>
-      <w:rFonts w:ascii="DejaVu Sans" w:hAnsi="DejaVu Sans"/>
+      <w:rFonts w:ascii="Arial" w:hAnsi="Arial"/>
       <w:color w:val="243746"/>
       <w:sz w:val="20"/>
+      <w:lang w:val="tr-TR"/>
     </w:rPr>
   </w:style>
   <w:style w:type="paragraph" w:customStyle="1" w:styleId="CivensaBaşlık1">
     <w:name w:val="Civensa Başlık 1"/>
     <w:basedOn w:val="CivensaGövde"/>
+    <w:qFormat/>
     <w:pPr>
       <w:keepNext/>
       <w:spacing w:before="300" w:after="120"/>
       <w:outlineLvl w:val="0"/>
     </w:pPr>
     <w:rPr>
+      <w:rFonts w:ascii="Arial" w:hAnsi="Arial"/>
       <w:b/>
       <w:color w:val="164E63"/>
       <w:sz w:val="36"/>
+      <w:lang w:val="tr-TR"/>
     </w:rPr>
   </w:style>
   <w:style w:type="paragraph" w:customStyle="1" w:styleId="CivensaBaşlık2">
     <w:name w:val="Civensa Başlık 2"/>
     <w:basedOn w:val="CivensaGövde"/>
+    <w:qFormat/>
     <w:pPr>
       <w:keepNext/>
       <w:spacing w:before="200" w:after="120"/>
       <w:outlineLvl w:val="1"/>
     </w:pPr>
     <w:rPr>
+      <w:rFonts w:ascii="Arial" w:hAnsi="Arial"/>
       <w:b/>
       <w:color w:val="164E63"/>
       <w:sz w:val="28"/>
+      <w:lang w:val="tr-TR"/>
     </w:rPr>
   </w:style>
   <w:style w:type="paragraph" w:customStyle="1" w:styleId="CivensaBaşlık3">
     <w:name w:val="Civensa Başlık 3"/>
     <w:basedOn w:val="CivensaGövde"/>
+    <w:qFormat/>
     <w:pPr>
       <w:keepNext/>
       <w:spacing w:before="200" w:after="120"/>
       <w:outlineLvl w:val="2"/>
     </w:pPr>
     <w:rPr>
+      <w:rFonts w:ascii="Arial" w:hAnsi="Arial"/>
       <w:b/>
       <w:color w:val="164E63"/>
       <w:sz w:val="24"/>
+      <w:lang w:val="tr-TR"/>
     </w:rPr>
   </w:style>
   <w:style w:type="paragraph" w:customStyle="1" w:styleId="CivensaBaşlık4">
     <w:name w:val="Civensa Başlık 4"/>
     <w:basedOn w:val="CivensaGövde"/>
+    <w:qFormat/>
     <w:pPr>
       <w:keepNext/>
       <w:spacing w:before="200" w:after="120"/>
       <w:outlineLvl w:val="3"/>
     </w:pPr>
     <w:rPr>
+      <w:rFonts w:ascii="Arial" w:hAnsi="Arial"/>
       <w:b/>
       <w:color w:val="164E63"/>
       <w:sz w:val="22"/>
+      <w:lang w:val="tr-TR"/>
+    </w:rPr>
+  </w:style>
+  <w:style w:type="paragraph" w:customStyle="1" w:styleId="TOC1">
+    <w:name w:val="TOC 1"/>
+    <w:basedOn w:val="CivensaGövde"/>
+    <w:pPr>
+      <w:spacing w:after="80" w:line="240" w:lineRule="auto"/>
+      <w:ind w:left="0"/>
+      <w:outlineLvl w:val="9"/>
+    </w:pPr>
+    <w:rPr>
+      <w:rFonts w:ascii="Arial" w:hAnsi="Arial"/>
+      <w:lang w:val="tr-TR"/>
+    </w:rPr>
+  </w:style>
+  <w:style w:type="paragraph" w:customStyle="1" w:styleId="TOC2">
+    <w:name w:val="TOC 2"/>
+    <w:basedOn w:val="CivensaGövde"/>
+    <w:pPr>
+      <w:spacing w:after="80" w:line="240" w:lineRule="auto"/>
+      <w:ind w:left="283"/>
+      <w:outlineLvl w:val="9"/>
+    </w:pPr>
+    <w:rPr>
+      <w:rFonts w:ascii="Arial" w:hAnsi="Arial"/>
+      <w:lang w:val="tr-TR"/>
+    </w:rPr>
+  </w:style>
+  <w:style w:type="paragraph" w:customStyle="1" w:styleId="TOC3">
+    <w:name w:val="TOC 3"/>
+    <w:basedOn w:val="CivensaGövde"/>
+    <w:pPr>
+      <w:spacing w:after="80" w:line="240" w:lineRule="auto"/>
+      <w:ind w:left="567"/>
+      <w:outlineLvl w:val="9"/>
+    </w:pPr>
+    <w:rPr>
+      <w:rFonts w:ascii="Arial" w:hAnsi="Arial"/>
+      <w:lang w:val="tr-TR"/>
     </w:rPr>
   </w:style>
   <w:style w:type="paragraph" w:customStyle="1" w:styleId="CivensaMadde">
@@ -12144,13 +12223,18 @@
       </w:numPr>
       <w:ind w:left="283" w:hanging="170"/>
     </w:pPr>
+    <w:rPr>
+      <w:rFonts w:ascii="Arial" w:hAnsi="Arial"/>
+      <w:lang w:val="tr-TR"/>
+    </w:rPr>
   </w:style>
   <w:style w:type="table" w:customStyle="1" w:styleId="CivensaTablo">
     <w:name w:val="Civensa Tablo"/>
     <w:basedOn w:val="TableGrid"/>
     <w:rPr>
-      <w:rFonts w:ascii="DejaVu Sans" w:hAnsi="DejaVu Sans"/>
+      <w:rFonts w:ascii="Arial" w:hAnsi="Arial"/>
       <w:sz w:val="18"/>
+      <w:lang w:val="tr-TR"/>
     </w:rPr>
   </w:style>
   <w:style w:type="paragraph" w:customStyle="1" w:styleId="CivensaTabloBaşlık">
@@ -12161,8 +12245,10 @@
       <w:spacing w:after="80"/>
     </w:pPr>
     <w:rPr>
+      <w:rFonts w:ascii="Arial" w:hAnsi="Arial"/>
       <w:b/>
       <w:sz w:val="18"/>
+      <w:lang w:val="tr-TR"/>
     </w:rPr>
   </w:style>
   <w:style w:type="paragraph" w:customStyle="1" w:styleId="CivensaNot">
@@ -12173,8 +12259,9 @@
       <w:shd w:fill="F0F4F6"/>
     </w:pPr>
     <w:rPr>
+      <w:rFonts w:ascii="Arial" w:hAnsi="Arial"/>
       <w:color w:val="52616B"/>
-      <w:sz w:val="16"/>
+      <w:lang w:val="tr-TR"/>
     </w:rPr>
   </w:style>
   <w:style w:type="paragraph" w:customStyle="1" w:styleId="CivensaKapakBaşlık">
@@ -12185,9 +12272,11 @@
       <w:jc w:val="center"/>
     </w:pPr>
     <w:rPr>
+      <w:rFonts w:ascii="Arial" w:hAnsi="Arial"/>
       <w:b/>
       <w:color w:val="164E63"/>
       <w:sz w:val="48"/>
+      <w:lang w:val="tr-TR"/>
     </w:rPr>
   </w:style>
 </w:styles>

</xml_diff>